<commit_message>
chore(iva): eliminar el apartado de retenciones (página contable y Word)
A pedido de Damián: se quita la sección de retención de IVA/ISR.
- Página /contable: eliminado el bloque "Retención de IVA / ISR" del Flujo
  del IVA (no quedan menciones).
- Word (reglas-iva-inyecta.docx): regenerado sin §8 (Retención), sin la
  subsección 7.4 (IsRetention), sin las filas de retención del resumen
  ejecutivo y de la tabla maestra, y sin el gap de retención; secciones
  renumeradas. 0 menciones de "retención" en el documento.

tsc limpio; 228/228 tests.

Co-Authored-By: Claude Opus 4.8 (1M context) <noreply@anthropic.com>
</commit_message>
<xml_diff>
--- a/client/public/reglas-iva-inyecta.docx
+++ b/client/public/reglas-iva-inyecta.docx
@@ -356,112 +356,6 @@
               <w:rPr>
                 <w:sz w:val="18"/>
               </w:rPr>
-              <w:t>¿Retención de IVA?</w:t>
-            </w:r>
-          </w:p>
-        </w:tc>
-        <w:tc>
-          <w:tcPr>
-            <w:tcW w:type="dxa" w:w="4680"/>
-          </w:tcPr>
-          <w:p>
-            <w:r>
-              <w:rPr>
-                <w:sz w:val="18"/>
-              </w:rPr>
-            </w:r>
-            <w:r>
-              <w:rPr>
-                <w:b/>
-                <w:sz w:val="18"/>
-              </w:rPr>
-              <w:t>NO se calcula.</w:t>
-            </w:r>
-            <w:r>
-              <w:rPr>
-                <w:sz w:val="18"/>
-              </w:rPr>
-              <w:t xml:space="preserve"> Campo </w:t>
-            </w:r>
-            <w:r>
-              <w:rPr>
-                <w:rFonts w:ascii="Consolas" w:hAnsi="Consolas"/>
-                <w:color w:val="333333"/>
-                <w:sz w:val="18"/>
-              </w:rPr>
-              <w:t>retenciones</w:t>
-            </w:r>
-            <w:r>
-              <w:rPr>
-                <w:sz w:val="18"/>
-              </w:rPr>
-              <w:t xml:space="preserve"> siempre = 0.</w:t>
-            </w:r>
-          </w:p>
-        </w:tc>
-      </w:tr>
-      <w:tr>
-        <w:tc>
-          <w:tcPr>
-            <w:tcW w:type="dxa" w:w="4680"/>
-            <w:shd w:val="clear" w:fill="F2F5F8"/>
-          </w:tcPr>
-          <w:p>
-            <w:r>
-              <w:rPr>
-                <w:sz w:val="18"/>
-              </w:rPr>
-            </w:r>
-            <w:r>
-              <w:rPr>
-                <w:sz w:val="18"/>
-              </w:rPr>
-              <w:t>¿Retención de ISR?</w:t>
-            </w:r>
-          </w:p>
-        </w:tc>
-        <w:tc>
-          <w:tcPr>
-            <w:tcW w:type="dxa" w:w="4680"/>
-            <w:shd w:val="clear" w:fill="F2F5F8"/>
-          </w:tcPr>
-          <w:p>
-            <w:r>
-              <w:rPr>
-                <w:sz w:val="18"/>
-              </w:rPr>
-            </w:r>
-            <w:r>
-              <w:rPr>
-                <w:b/>
-                <w:sz w:val="18"/>
-              </w:rPr>
-              <w:t>NO se calcula.</w:t>
-            </w:r>
-            <w:r>
-              <w:rPr>
-                <w:sz w:val="18"/>
-              </w:rPr>
-              <w:t xml:space="preserve"> No hay complemento RetencionISR.</w:t>
-            </w:r>
-          </w:p>
-        </w:tc>
-      </w:tr>
-      <w:tr>
-        <w:tc>
-          <w:tcPr>
-            <w:tcW w:type="dxa" w:w="4680"/>
-          </w:tcPr>
-          <w:p>
-            <w:r>
-              <w:rPr>
-                <w:sz w:val="18"/>
-              </w:rPr>
-            </w:r>
-            <w:r>
-              <w:rPr>
-                <w:sz w:val="18"/>
-              </w:rPr>
               <w:t>¿IVA acreditable?</w:t>
             </w:r>
           </w:p>
@@ -584,7 +478,7 @@
               <w:rPr>
                 <w:sz w:val="18"/>
               </w:rPr>
-              <w:t>(a) Categorización del IVA de comisión financiada en el CFDI; (b) cualquier política de retención.</w:t>
+              <w:t>Categorización del IVA de comisión financiada en el CFDI.</w:t>
             </w:r>
           </w:p>
         </w:tc>
@@ -4678,117 +4572,6 @@
     </w:p>
     <w:p>
       <w:pPr>
-        <w:spacing w:before="160" w:after="80"/>
-      </w:pPr>
-      <w:r>
-        <w:rPr>
-          <w:b/>
-          <w:color w:val="112239"/>
-          <w:sz w:val="22"/>
-        </w:rPr>
-        <w:t>7.4 Taxes / IsRetention (integración Facturama)</w:t>
-      </w:r>
-    </w:p>
-    <w:p>
-      <w:pPr>
-        <w:pStyle w:val="ListBullet"/>
-      </w:pPr>
-      <w:r>
-        <w:rPr>
-          <w:sz w:val="20"/>
-        </w:rPr>
-        <w:t xml:space="preserve">Cada concepto: </w:t>
-      </w:r>
-      <w:r>
-        <w:rPr>
-          <w:rFonts w:ascii="Consolas" w:hAnsi="Consolas"/>
-          <w:color w:val="333333"/>
-          <w:sz w:val="20"/>
-        </w:rPr>
-        <w:t>{ Name:'IVA', Rate:0.16, IsRetention:false }</w:t>
-      </w:r>
-      <w:r>
-        <w:rPr>
-          <w:sz w:val="20"/>
-        </w:rPr>
-        <w:t xml:space="preserve">. </w:t>
-      </w:r>
-      <w:r>
-        <w:rPr>
-          <w:rFonts w:ascii="Consolas" w:hAnsi="Consolas"/>
-          <w:color w:val="333333"/>
-          <w:sz w:val="20"/>
-        </w:rPr>
-        <w:t>IsRetention = false</w:t>
-      </w:r>
-      <w:r>
-        <w:rPr>
-          <w:sz w:val="20"/>
-        </w:rPr>
-        <w:t xml:space="preserve"> siempre → </w:t>
-      </w:r>
-      <w:r>
-        <w:rPr>
-          <w:b/>
-          <w:sz w:val="20"/>
-        </w:rPr>
-        <w:t>IVA TRASLADADO, nunca retenido</w:t>
-      </w:r>
-      <w:r>
-        <w:rPr>
-          <w:sz w:val="20"/>
-        </w:rPr>
-        <w:t>.</w:t>
-      </w:r>
-    </w:p>
-    <w:p>
-      <w:pPr>
-        <w:pStyle w:val="ListBullet"/>
-      </w:pPr>
-      <w:r>
-        <w:rPr>
-          <w:b/>
-          <w:sz w:val="20"/>
-        </w:rPr>
-        <w:t>Referencia:</w:t>
-      </w:r>
-      <w:r>
-        <w:rPr>
-          <w:sz w:val="20"/>
-        </w:rPr>
-        <w:t xml:space="preserve"> </w:t>
-      </w:r>
-      <w:r>
-        <w:rPr>
-          <w:rFonts w:ascii="Consolas" w:hAnsi="Consolas"/>
-          <w:color w:val="333333"/>
-          <w:sz w:val="20"/>
-        </w:rPr>
-        <w:t>server/src/services/cfdiProvider.ts:246-254</w:t>
-      </w:r>
-      <w:r>
-        <w:rPr>
-          <w:sz w:val="20"/>
-        </w:rPr>
-        <w:t xml:space="preserve">, </w:t>
-      </w:r>
-      <w:r>
-        <w:rPr>
-          <w:rFonts w:ascii="Consolas" w:hAnsi="Consolas"/>
-          <w:color w:val="333333"/>
-          <w:sz w:val="20"/>
-        </w:rPr>
-        <w:t>:43</w:t>
-      </w:r>
-      <w:r>
-        <w:rPr>
-          <w:sz w:val="20"/>
-        </w:rPr>
-        <w:t>.</w:t>
-      </w:r>
-    </w:p>
-    <w:p>
-      <w:pPr>
         <w:spacing w:before="40" w:after="40"/>
         <w:ind w:left="360"/>
       </w:pPr>
@@ -4840,7 +4623,227 @@
           <w:color w:val="112239"/>
           <w:sz w:val="26"/>
         </w:rPr>
-        <w:t>8. RETENCIÓN de IVA / ISR — declaración explícita</w:t>
+        <w:t>8. Brechas conocidas (gaps) relevantes para el contador</w:t>
+      </w:r>
+    </w:p>
+    <w:p>
+      <w:r>
+        <w:t>Estas son limitaciones reales del sistema, no errores. Requieren proceso manual o decisión:</w:t>
+      </w:r>
+    </w:p>
+    <w:p>
+      <w:pPr>
+        <w:pStyle w:val="ListNumber"/>
+      </w:pPr>
+      <w:r>
+        <w:rPr>
+          <w:b/>
+          <w:sz w:val="20"/>
+        </w:rPr>
+        <w:t>IVA exento / tasa 0%:</w:t>
+      </w:r>
+      <w:r>
+        <w:rPr>
+          <w:sz w:val="20"/>
+        </w:rPr>
+        <w:t xml:space="preserve"> no soportado. El sistema asume 16% para </w:t>
+      </w:r>
+      <w:r>
+        <w:rPr>
+          <w:b/>
+          <w:sz w:val="20"/>
+        </w:rPr>
+        <w:t>todas</w:t>
+      </w:r>
+      <w:r>
+        <w:rPr>
+          <w:sz w:val="20"/>
+        </w:rPr>
+        <w:t xml:space="preserve"> las operaciones (no maneja arrendamientos exentos, vivienda, educación, exportadores, tasa fronteriza).</w:t>
+      </w:r>
+    </w:p>
+    <w:p>
+      <w:pPr>
+        <w:pStyle w:val="ListNumber"/>
+      </w:pPr>
+      <w:r>
+        <w:rPr>
+          <w:b/>
+          <w:sz w:val="20"/>
+        </w:rPr>
+        <w:t>Cambio de tasa de IVA:</w:t>
+      </w:r>
+      <w:r>
+        <w:rPr>
+          <w:sz w:val="20"/>
+        </w:rPr>
+        <w:t xml:space="preserve"> la tasa es literal </w:t>
+      </w:r>
+      <w:r>
+        <w:rPr>
+          <w:rFonts w:ascii="Consolas" w:hAnsi="Consolas"/>
+          <w:color w:val="333333"/>
+          <w:sz w:val="20"/>
+        </w:rPr>
+        <w:t>0.16</w:t>
+      </w:r>
+      <w:r>
+        <w:rPr>
+          <w:sz w:val="20"/>
+        </w:rPr>
+        <w:t xml:space="preserve"> en todo el código. Una reforma fiscal requiere editar constantes y migrar operaciones vigentes.</w:t>
+      </w:r>
+    </w:p>
+    <w:p>
+      <w:pPr>
+        <w:pStyle w:val="ListNumber"/>
+      </w:pPr>
+      <w:r>
+        <w:rPr>
+          <w:b/>
+          <w:sz w:val="20"/>
+        </w:rPr>
+        <w:t>Segregación de IVA acreditable vs. trasladado en reportes:</w:t>
+      </w:r>
+      <w:r>
+        <w:rPr>
+          <w:sz w:val="20"/>
+        </w:rPr>
+        <w:t xml:space="preserve"> el CFDI lo distingue en el XML, pero </w:t>
+      </w:r>
+      <w:r>
+        <w:rPr>
+          <w:b/>
+          <w:sz w:val="20"/>
+        </w:rPr>
+        <w:t>no hay reporte interno</w:t>
+      </w:r>
+      <w:r>
+        <w:rPr>
+          <w:sz w:val="20"/>
+        </w:rPr>
+        <w:t xml:space="preserve"> que separe el IVA acreditable por concepto. Mapeo manual del contador.</w:t>
+      </w:r>
+    </w:p>
+    <w:p>
+      <w:pPr>
+        <w:pStyle w:val="ListNumber"/>
+      </w:pPr>
+      <w:r>
+        <w:rPr>
+          <w:b/>
+          <w:sz w:val="20"/>
+        </w:rPr>
+        <w:t>Desglose contable de IVA por origen:</w:t>
+      </w:r>
+      <w:r>
+        <w:rPr>
+          <w:sz w:val="20"/>
+        </w:rPr>
+        <w:t xml:space="preserve"> los reportes no separan "IVA del enganche" / "IVA de comisión" / "IVA de renta".</w:t>
+      </w:r>
+    </w:p>
+    <w:p>
+      <w:pPr>
+        <w:pStyle w:val="ListNumber"/>
+      </w:pPr>
+      <w:r>
+        <w:rPr>
+          <w:b/>
+          <w:sz w:val="20"/>
+        </w:rPr>
+        <w:t>Reconciliación automática del IVA del bien (§6.2):</w:t>
+      </w:r>
+      <w:r>
+        <w:rPr>
+          <w:sz w:val="20"/>
+        </w:rPr>
+        <w:t xml:space="preserve"> no se valida en sistema; es tarea de auditoría externa.</w:t>
+      </w:r>
+    </w:p>
+    <w:p>
+      <w:pPr>
+        <w:pStyle w:val="ListNumber"/>
+      </w:pPr>
+      <w:r>
+        <w:rPr>
+          <w:b/>
+          <w:sz w:val="20"/>
+        </w:rPr>
+        <w:t>IVA en devoluciones, cancelaciones o rescisiones:</w:t>
+      </w:r>
+      <w:r>
+        <w:rPr>
+          <w:sz w:val="20"/>
+        </w:rPr>
+        <w:t xml:space="preserve"> </w:t>
+      </w:r>
+      <w:r>
+        <w:rPr>
+          <w:b/>
+          <w:sz w:val="20"/>
+        </w:rPr>
+        <w:t>no documentado</w:t>
+      </w:r>
+      <w:r>
+        <w:rPr>
+          <w:sz w:val="20"/>
+        </w:rPr>
+        <w:t xml:space="preserve"> en CLAUDE.md. Gap explícito.</w:t>
+      </w:r>
+    </w:p>
+    <w:p>
+      <w:pPr>
+        <w:pStyle w:val="ListNumber"/>
+      </w:pPr>
+      <w:r>
+        <w:rPr>
+          <w:b/>
+          <w:sz w:val="20"/>
+        </w:rPr>
+        <w:t>Snapshot de IVA al momento exacto del pago:</w:t>
+      </w:r>
+      <w:r>
+        <w:rPr>
+          <w:sz w:val="20"/>
+        </w:rPr>
+        <w:t xml:space="preserve"> no se persiste para auditoría (solo acumulados del período en el Payment, más bitácora).</w:t>
+      </w:r>
+    </w:p>
+    <w:p>
+      <w:pPr>
+        <w:pStyle w:val="ListNumber"/>
+      </w:pPr>
+      <w:r>
+        <w:rPr>
+          <w:b/>
+          <w:sz w:val="20"/>
+        </w:rPr>
+        <w:t>Categorización del IVA por tipo de comprobante</w:t>
+      </w:r>
+      <w:r>
+        <w:rPr>
+          <w:sz w:val="20"/>
+        </w:rPr>
+        <w:t xml:space="preserve"> (ingreso vs. pago vs. nota de crédito): la categorización vive en la facturación/CFDI, no en el motor (descubierto en campo durante T12).</w:t>
+      </w:r>
+    </w:p>
+    <w:p>
+      <w:pPr>
+        <w:pStyle w:val="ListNumber"/>
+      </w:pPr>
+      <w:r>
+        <w:rPr>
+          <w:b/>
+          <w:sz w:val="20"/>
+        </w:rPr>
+        <w:t>Provisión/reserva de IVA moratorio acumulado:</w:t>
+      </w:r>
+      <w:r>
+        <w:rPr>
+          <w:sz w:val="20"/>
+        </w:rPr>
+        <w:t xml:space="preserve"> el cálculo es punto a punto por período, sin agregación de saldos previos en mora.</w:t>
       </w:r>
     </w:p>
     <w:p>
@@ -4850,610 +4853,10 @@
       <w:r>
         <w:rPr>
           <w:b/>
-          <w:color w:val="184892"/>
-          <w:sz w:val="30"/>
-        </w:rPr>
-        <w:t>❌ NO. El sistema NO calcula ni aplica retención de IVA ni de ISR.</w:t>
-      </w:r>
-    </w:p>
-    <w:p>
-      <w:pPr>
-        <w:pStyle w:val="ListBullet"/>
-      </w:pPr>
-      <w:r>
-        <w:rPr>
-          <w:b/>
-          <w:sz w:val="20"/>
-        </w:rPr>
-        <w:t>IVA:</w:t>
-      </w:r>
-      <w:r>
-        <w:rPr>
-          <w:sz w:val="20"/>
-        </w:rPr>
-        <w:t xml:space="preserve"> No hay retención. Todos los CFDI se emiten 100% con IVA </w:t>
-      </w:r>
-      <w:r>
-        <w:rPr>
-          <w:b/>
-          <w:sz w:val="20"/>
-        </w:rPr>
-        <w:t>trasladado</w:t>
-      </w:r>
-      <w:r>
-        <w:rPr>
-          <w:sz w:val="20"/>
-        </w:rPr>
-        <w:t xml:space="preserve"> (</w:t>
-      </w:r>
-      <w:r>
-        <w:rPr>
-          <w:rFonts w:ascii="Consolas" w:hAnsi="Consolas"/>
-          <w:color w:val="333333"/>
-          <w:sz w:val="20"/>
-        </w:rPr>
-        <w:t>ObjetoImp="02"</w:t>
-      </w:r>
-      <w:r>
-        <w:rPr>
-          <w:sz w:val="20"/>
-        </w:rPr>
-        <w:t xml:space="preserve">, </w:t>
-      </w:r>
-      <w:r>
-        <w:rPr>
-          <w:rFonts w:ascii="Consolas" w:hAnsi="Consolas"/>
-          <w:color w:val="333333"/>
-          <w:sz w:val="20"/>
-        </w:rPr>
-        <w:t>IsRetention=false</w:t>
-      </w:r>
-      <w:r>
-        <w:rPr>
-          <w:sz w:val="20"/>
-        </w:rPr>
-        <w:t>).</w:t>
-      </w:r>
-    </w:p>
-    <w:p>
-      <w:pPr>
-        <w:pStyle w:val="ListBullet"/>
-      </w:pPr>
-      <w:r>
-        <w:rPr>
-          <w:b/>
-          <w:sz w:val="20"/>
-        </w:rPr>
-        <w:t>ISR:</w:t>
-      </w:r>
-      <w:r>
-        <w:rPr>
-          <w:sz w:val="20"/>
-        </w:rPr>
-        <w:t xml:space="preserve"> No hay retención. No se genera el complemento RetencionISR del Anexo 20.</w:t>
-      </w:r>
-    </w:p>
-    <w:p>
-      <w:pPr>
-        <w:pStyle w:val="ListBullet"/>
-      </w:pPr>
-      <w:r>
-        <w:rPr>
-          <w:sz w:val="20"/>
-        </w:rPr>
-        <w:t xml:space="preserve">El campo </w:t>
-      </w:r>
-      <w:r>
-        <w:rPr>
-          <w:rFonts w:ascii="Consolas" w:hAnsi="Consolas"/>
-          <w:color w:val="333333"/>
-          <w:sz w:val="20"/>
-        </w:rPr>
-        <w:t>retenciones</w:t>
-      </w:r>
-      <w:r>
-        <w:rPr>
-          <w:sz w:val="20"/>
-        </w:rPr>
-        <w:t xml:space="preserve"> existe en el modelo (</w:t>
-      </w:r>
-      <w:r>
-        <w:rPr>
-          <w:rFonts w:ascii="Consolas" w:hAnsi="Consolas"/>
-          <w:color w:val="333333"/>
-          <w:sz w:val="20"/>
-        </w:rPr>
-        <w:t>Invoice.retenciones</w:t>
-      </w:r>
-      <w:r>
-        <w:rPr>
-          <w:sz w:val="20"/>
-        </w:rPr>
-        <w:t xml:space="preserve">, </w:t>
-      </w:r>
-      <w:r>
-        <w:rPr>
-          <w:rFonts w:ascii="Consolas" w:hAnsi="Consolas"/>
-          <w:color w:val="333333"/>
-          <w:sz w:val="20"/>
-        </w:rPr>
-        <w:t>CfdiInvoiceInput.retenciones</w:t>
-      </w:r>
-      <w:r>
-        <w:rPr>
-          <w:sz w:val="20"/>
-        </w:rPr>
-        <w:t xml:space="preserve">) </w:t>
-      </w:r>
-      <w:r>
-        <w:rPr>
-          <w:b/>
-          <w:sz w:val="20"/>
-        </w:rPr>
-        <w:t>únicamente como placeholder en 0</w:t>
-      </w:r>
-      <w:r>
-        <w:rPr>
-          <w:sz w:val="20"/>
-        </w:rPr>
-        <w:t xml:space="preserve"> para cumplir el esquema; </w:t>
-      </w:r>
-      <w:r>
-        <w:rPr>
-          <w:b/>
-          <w:sz w:val="20"/>
-        </w:rPr>
-        <w:t>no hay lógica de cálculo</w:t>
-      </w:r>
-      <w:r>
-        <w:rPr>
-          <w:sz w:val="20"/>
-        </w:rPr>
-        <w:t>.</w:t>
-      </w:r>
-    </w:p>
-    <w:p>
-      <w:pPr>
-        <w:pStyle w:val="ListBullet"/>
-      </w:pPr>
-      <w:r>
-        <w:rPr>
-          <w:b/>
-          <w:sz w:val="20"/>
-        </w:rPr>
-        <w:t>Evidencia (incluida evidencia negativa):</w:t>
-      </w:r>
-    </w:p>
-    <w:p>
-      <w:pPr>
-        <w:pStyle w:val="ListBullet"/>
-      </w:pPr>
-      <w:r>
-        <w:rPr>
-          <w:rFonts w:ascii="Consolas" w:hAnsi="Consolas"/>
-          <w:color w:val="333333"/>
-          <w:sz w:val="20"/>
-        </w:rPr>
-        <w:t>retenciones: 0</w:t>
-      </w:r>
-      <w:r>
-        <w:rPr>
-          <w:sz w:val="20"/>
-        </w:rPr>
-        <w:t xml:space="preserve"> hardcodeado en </w:t>
-      </w:r>
-      <w:r>
-        <w:rPr>
-          <w:rFonts w:ascii="Consolas" w:hAnsi="Consolas"/>
-          <w:color w:val="333333"/>
-          <w:sz w:val="20"/>
-        </w:rPr>
-        <w:t>server/src/routes/invoices.ts:216,305,412,439</w:t>
-      </w:r>
-      <w:r>
-        <w:rPr>
-          <w:sz w:val="20"/>
-        </w:rPr>
-        <w:t>.</w:t>
-      </w:r>
-    </w:p>
-    <w:p>
-      <w:pPr>
-        <w:pStyle w:val="ListBullet"/>
-      </w:pPr>
-      <w:r>
-        <w:rPr>
-          <w:rFonts w:ascii="Consolas" w:hAnsi="Consolas"/>
-          <w:color w:val="333333"/>
-          <w:sz w:val="20"/>
-        </w:rPr>
-        <w:t>server/src/services/cfdiProvider.ts:43</w:t>
-      </w:r>
-      <w:r>
-        <w:rPr>
-          <w:sz w:val="20"/>
-        </w:rPr>
-        <w:t xml:space="preserve"> (campo sin cálculo).</w:t>
-      </w:r>
-    </w:p>
-    <w:p>
-      <w:pPr>
-        <w:pStyle w:val="ListBullet"/>
-      </w:pPr>
-      <w:r>
-        <w:rPr>
-          <w:rFonts w:ascii="Consolas" w:hAnsi="Consolas"/>
-          <w:color w:val="333333"/>
-          <w:sz w:val="20"/>
-        </w:rPr>
-        <w:t>server/prisma/schema.prisma</w:t>
-      </w:r>
-      <w:r>
-        <w:rPr>
-          <w:sz w:val="20"/>
-        </w:rPr>
-        <w:t xml:space="preserve">: </w:t>
-      </w:r>
-      <w:r>
-        <w:rPr>
-          <w:rFonts w:ascii="Consolas" w:hAnsi="Consolas"/>
-          <w:color w:val="333333"/>
-          <w:sz w:val="20"/>
-        </w:rPr>
-        <w:t>Invoice.retenciones Decimal @default(0)</w:t>
-      </w:r>
-      <w:r>
-        <w:rPr>
-          <w:sz w:val="20"/>
-        </w:rPr>
-        <w:t>.</w:t>
-      </w:r>
-    </w:p>
-    <w:p>
-      <w:pPr>
-        <w:pStyle w:val="ListBullet"/>
-      </w:pPr>
-      <w:r>
-        <w:rPr>
-          <w:rFonts w:ascii="Consolas" w:hAnsi="Consolas"/>
-          <w:color w:val="333333"/>
-          <w:sz w:val="20"/>
-        </w:rPr>
-        <w:t>grep -r 'retenc|withhold|ISR' server/src</w:t>
-      </w:r>
-      <w:r>
-        <w:rPr>
-          <w:sz w:val="20"/>
-        </w:rPr>
-        <w:t xml:space="preserve"> → solo </w:t>
-      </w:r>
-      <w:r>
-        <w:rPr>
-          <w:rFonts w:ascii="Consolas" w:hAnsi="Consolas"/>
-          <w:color w:val="333333"/>
-          <w:sz w:val="20"/>
-        </w:rPr>
-        <w:t>retenciones: 0</w:t>
-      </w:r>
-      <w:r>
-        <w:rPr>
-          <w:sz w:val="20"/>
-        </w:rPr>
-        <w:t xml:space="preserve"> y referencias al campo vacío. </w:t>
-      </w:r>
-      <w:r>
-        <w:rPr>
-          <w:b/>
-          <w:sz w:val="20"/>
-        </w:rPr>
-        <w:t>Cero lógica activa.</w:t>
-      </w:r>
-    </w:p>
-    <w:p>
-      <w:pPr>
-        <w:spacing w:before="40" w:after="40"/>
-        <w:ind w:left="360"/>
-      </w:pPr>
-      <w:r>
-        <w:rPr>
-          <w:color w:val="664400"/>
-          <w:sz w:val="19"/>
-        </w:rPr>
-        <w:t xml:space="preserve">🔶 </w:t>
-      </w:r>
-      <w:r>
-        <w:rPr>
-          <w:b/>
-          <w:color w:val="664400"/>
-          <w:sz w:val="19"/>
-        </w:rPr>
-        <w:t>DECISIÓN PENDIENTE CON EL CONTADOR:</w:t>
-      </w:r>
-      <w:r>
-        <w:rPr>
-          <w:color w:val="664400"/>
-          <w:sz w:val="19"/>
-        </w:rPr>
-        <w:t xml:space="preserve"> Si la operación con clientes Persona Moral u otros regímenes obliga a retención (Art. 1-B / 1-C / 3 LIVA, o ISR), </w:t>
-      </w:r>
-      <w:r>
-        <w:rPr>
-          <w:b/>
-          <w:color w:val="664400"/>
-          <w:sz w:val="19"/>
-        </w:rPr>
-        <w:t>debe definirse e implementarse</w:t>
-      </w:r>
-      <w:r>
-        <w:rPr>
-          <w:color w:val="664400"/>
-          <w:sz w:val="19"/>
-        </w:rPr>
-        <w:t xml:space="preserve"> — hoy no existe.</w:t>
-      </w:r>
-    </w:p>
-    <w:p>
-      <w:pPr>
-        <w:spacing w:before="240" w:after="80"/>
-      </w:pPr>
-      <w:r>
-        <w:rPr>
-          <w:b/>
           <w:color w:val="112239"/>
           <w:sz w:val="26"/>
         </w:rPr>
-        <w:t>9. Brechas conocidas (gaps) relevantes para el contador</w:t>
-      </w:r>
-    </w:p>
-    <w:p>
-      <w:r>
-        <w:t>Estas son limitaciones reales del sistema, no errores. Requieren proceso manual o decisión:</w:t>
-      </w:r>
-    </w:p>
-    <w:p>
-      <w:pPr>
-        <w:pStyle w:val="ListNumber"/>
-      </w:pPr>
-      <w:r>
-        <w:rPr>
-          <w:b/>
-          <w:sz w:val="20"/>
-        </w:rPr>
-        <w:t>Retención de IVA e ISR:</w:t>
-      </w:r>
-      <w:r>
-        <w:rPr>
-          <w:sz w:val="20"/>
-        </w:rPr>
-        <w:t xml:space="preserve"> no implementadas (ver §8). Sin validación de obligación de retener, sin constancias, sin acreditamiento de retenciones recibidas, sin complemento de retención en Pagos20.</w:t>
-      </w:r>
-    </w:p>
-    <w:p>
-      <w:pPr>
-        <w:pStyle w:val="ListNumber"/>
-      </w:pPr>
-      <w:r>
-        <w:rPr>
-          <w:b/>
-          <w:sz w:val="20"/>
-        </w:rPr>
-        <w:t>IVA exento / tasa 0%:</w:t>
-      </w:r>
-      <w:r>
-        <w:rPr>
-          <w:sz w:val="20"/>
-        </w:rPr>
-        <w:t xml:space="preserve"> no soportado. El sistema asume 16% para </w:t>
-      </w:r>
-      <w:r>
-        <w:rPr>
-          <w:b/>
-          <w:sz w:val="20"/>
-        </w:rPr>
-        <w:t>todas</w:t>
-      </w:r>
-      <w:r>
-        <w:rPr>
-          <w:sz w:val="20"/>
-        </w:rPr>
-        <w:t xml:space="preserve"> las operaciones (no maneja arrendamientos exentos, vivienda, educación, exportadores, tasa fronteriza).</w:t>
-      </w:r>
-    </w:p>
-    <w:p>
-      <w:pPr>
-        <w:pStyle w:val="ListNumber"/>
-      </w:pPr>
-      <w:r>
-        <w:rPr>
-          <w:b/>
-          <w:sz w:val="20"/>
-        </w:rPr>
-        <w:t>Cambio de tasa de IVA:</w:t>
-      </w:r>
-      <w:r>
-        <w:rPr>
-          <w:sz w:val="20"/>
-        </w:rPr>
-        <w:t xml:space="preserve"> la tasa es literal </w:t>
-      </w:r>
-      <w:r>
-        <w:rPr>
-          <w:rFonts w:ascii="Consolas" w:hAnsi="Consolas"/>
-          <w:color w:val="333333"/>
-          <w:sz w:val="20"/>
-        </w:rPr>
-        <w:t>0.16</w:t>
-      </w:r>
-      <w:r>
-        <w:rPr>
-          <w:sz w:val="20"/>
-        </w:rPr>
-        <w:t xml:space="preserve"> en todo el código. Una reforma fiscal requiere editar constantes y migrar operaciones vigentes.</w:t>
-      </w:r>
-    </w:p>
-    <w:p>
-      <w:pPr>
-        <w:pStyle w:val="ListNumber"/>
-      </w:pPr>
-      <w:r>
-        <w:rPr>
-          <w:b/>
-          <w:sz w:val="20"/>
-        </w:rPr>
-        <w:t>Segregación de IVA acreditable vs. trasladado en reportes:</w:t>
-      </w:r>
-      <w:r>
-        <w:rPr>
-          <w:sz w:val="20"/>
-        </w:rPr>
-        <w:t xml:space="preserve"> el CFDI lo distingue en el XML, pero </w:t>
-      </w:r>
-      <w:r>
-        <w:rPr>
-          <w:b/>
-          <w:sz w:val="20"/>
-        </w:rPr>
-        <w:t>no hay reporte interno</w:t>
-      </w:r>
-      <w:r>
-        <w:rPr>
-          <w:sz w:val="20"/>
-        </w:rPr>
-        <w:t xml:space="preserve"> que separe el IVA acreditable por concepto. Mapeo manual del contador.</w:t>
-      </w:r>
-    </w:p>
-    <w:p>
-      <w:pPr>
-        <w:pStyle w:val="ListNumber"/>
-      </w:pPr>
-      <w:r>
-        <w:rPr>
-          <w:b/>
-          <w:sz w:val="20"/>
-        </w:rPr>
-        <w:t>Desglose contable de IVA por origen:</w:t>
-      </w:r>
-      <w:r>
-        <w:rPr>
-          <w:sz w:val="20"/>
-        </w:rPr>
-        <w:t xml:space="preserve"> los reportes no separan "IVA del enganche" / "IVA de comisión" / "IVA de renta".</w:t>
-      </w:r>
-    </w:p>
-    <w:p>
-      <w:pPr>
-        <w:pStyle w:val="ListNumber"/>
-      </w:pPr>
-      <w:r>
-        <w:rPr>
-          <w:b/>
-          <w:sz w:val="20"/>
-        </w:rPr>
-        <w:t>Reconciliación automática del IVA del bien (§6.2):</w:t>
-      </w:r>
-      <w:r>
-        <w:rPr>
-          <w:sz w:val="20"/>
-        </w:rPr>
-        <w:t xml:space="preserve"> no se valida en sistema; es tarea de auditoría externa.</w:t>
-      </w:r>
-    </w:p>
-    <w:p>
-      <w:pPr>
-        <w:pStyle w:val="ListNumber"/>
-      </w:pPr>
-      <w:r>
-        <w:rPr>
-          <w:b/>
-          <w:sz w:val="20"/>
-        </w:rPr>
-        <w:t>IVA en devoluciones, cancelaciones o rescisiones:</w:t>
-      </w:r>
-      <w:r>
-        <w:rPr>
-          <w:sz w:val="20"/>
-        </w:rPr>
-        <w:t xml:space="preserve"> </w:t>
-      </w:r>
-      <w:r>
-        <w:rPr>
-          <w:b/>
-          <w:sz w:val="20"/>
-        </w:rPr>
-        <w:t>no documentado</w:t>
-      </w:r>
-      <w:r>
-        <w:rPr>
-          <w:sz w:val="20"/>
-        </w:rPr>
-        <w:t xml:space="preserve"> en CLAUDE.md. Gap explícito.</w:t>
-      </w:r>
-    </w:p>
-    <w:p>
-      <w:pPr>
-        <w:pStyle w:val="ListNumber"/>
-      </w:pPr>
-      <w:r>
-        <w:rPr>
-          <w:b/>
-          <w:sz w:val="20"/>
-        </w:rPr>
-        <w:t>Snapshot de IVA al momento exacto del pago:</w:t>
-      </w:r>
-      <w:r>
-        <w:rPr>
-          <w:sz w:val="20"/>
-        </w:rPr>
-        <w:t xml:space="preserve"> no se persiste para auditoría (solo acumulados del período en el Payment, más bitácora).</w:t>
-      </w:r>
-    </w:p>
-    <w:p>
-      <w:pPr>
-        <w:pStyle w:val="ListNumber"/>
-      </w:pPr>
-      <w:r>
-        <w:rPr>
-          <w:b/>
-          <w:sz w:val="20"/>
-        </w:rPr>
-        <w:t>Categorización del IVA por tipo de comprobante</w:t>
-      </w:r>
-      <w:r>
-        <w:rPr>
-          <w:sz w:val="20"/>
-        </w:rPr>
-        <w:t xml:space="preserve"> (ingreso vs. pago vs. nota de crédito): la categorización vive en la facturación/CFDI, no en el motor (descubierto en campo durante T12).</w:t>
-      </w:r>
-    </w:p>
-    <w:p>
-      <w:pPr>
-        <w:pStyle w:val="ListNumber"/>
-      </w:pPr>
-      <w:r>
-        <w:rPr>
-          <w:b/>
-          <w:sz w:val="20"/>
-        </w:rPr>
-        <w:t>Provisión/reserva de IVA moratorio acumulado:</w:t>
-      </w:r>
-      <w:r>
-        <w:rPr>
-          <w:sz w:val="20"/>
-        </w:rPr>
-        <w:t xml:space="preserve"> el cálculo es punto a punto por período, sin agregación de saldos previos en mora.</w:t>
-      </w:r>
-    </w:p>
-    <w:p>
-      <w:pPr>
-        <w:spacing w:before="240" w:after="80"/>
-      </w:pPr>
-      <w:r>
-        <w:rPr>
-          <w:b/>
-          <w:color w:val="112239"/>
-          <w:sz w:val="26"/>
-        </w:rPr>
-        <w:t>10. Tabla maestra de conceptos de IVA</w:t>
+        <w:t>9. Tabla maestra de conceptos de IVA</w:t>
       </w:r>
     </w:p>
     <w:tbl>
@@ -6980,135 +6383,6 @@
           </w:p>
         </w:tc>
       </w:tr>
-      <w:tr>
-        <w:tc>
-          <w:tcPr>
-            <w:tcW w:type="dxa" w:w="1337"/>
-          </w:tcPr>
-          <w:p>
-            <w:r>
-              <w:rPr>
-                <w:sz w:val="18"/>
-              </w:rPr>
-            </w:r>
-            <w:r>
-              <w:rPr>
-                <w:sz w:val="18"/>
-              </w:rPr>
-              <w:t>11</w:t>
-            </w:r>
-          </w:p>
-        </w:tc>
-        <w:tc>
-          <w:tcPr>
-            <w:tcW w:type="dxa" w:w="1337"/>
-          </w:tcPr>
-          <w:p>
-            <w:r>
-              <w:rPr>
-                <w:sz w:val="18"/>
-              </w:rPr>
-            </w:r>
-            <w:r>
-              <w:rPr>
-                <w:sz w:val="18"/>
-              </w:rPr>
-              <w:t>Retención IVA/ISR</w:t>
-            </w:r>
-          </w:p>
-        </w:tc>
-        <w:tc>
-          <w:tcPr>
-            <w:tcW w:type="dxa" w:w="1337"/>
-          </w:tcPr>
-          <w:p>
-            <w:r>
-              <w:rPr>
-                <w:sz w:val="18"/>
-              </w:rPr>
-            </w:r>
-            <w:r>
-              <w:rPr>
-                <w:sz w:val="18"/>
-              </w:rPr>
-              <w:t>—</w:t>
-            </w:r>
-          </w:p>
-        </w:tc>
-        <w:tc>
-          <w:tcPr>
-            <w:tcW w:type="dxa" w:w="1337"/>
-          </w:tcPr>
-          <w:p>
-            <w:r>
-              <w:rPr>
-                <w:sz w:val="18"/>
-              </w:rPr>
-            </w:r>
-            <w:r>
-              <w:rPr>
-                <w:b/>
-                <w:sz w:val="18"/>
-              </w:rPr>
-              <w:t>NO EXISTE</w:t>
-            </w:r>
-          </w:p>
-        </w:tc>
-        <w:tc>
-          <w:tcPr>
-            <w:tcW w:type="dxa" w:w="1337"/>
-          </w:tcPr>
-          <w:p>
-            <w:r>
-              <w:rPr>
-                <w:sz w:val="18"/>
-              </w:rPr>
-            </w:r>
-            <w:r>
-              <w:rPr>
-                <w:sz w:val="18"/>
-              </w:rPr>
-              <w:t>—</w:t>
-            </w:r>
-          </w:p>
-        </w:tc>
-        <w:tc>
-          <w:tcPr>
-            <w:tcW w:type="dxa" w:w="1337"/>
-          </w:tcPr>
-          <w:p>
-            <w:r>
-              <w:rPr>
-                <w:sz w:val="18"/>
-              </w:rPr>
-            </w:r>
-            <w:r>
-              <w:rPr>
-                <w:sz w:val="18"/>
-              </w:rPr>
-              <w:t>—</w:t>
-            </w:r>
-          </w:p>
-        </w:tc>
-        <w:tc>
-          <w:tcPr>
-            <w:tcW w:type="dxa" w:w="1337"/>
-          </w:tcPr>
-          <w:p>
-            <w:r>
-              <w:rPr>
-                <w:sz w:val="18"/>
-              </w:rPr>
-            </w:r>
-            <w:r>
-              <w:rPr>
-                <w:sz w:val="18"/>
-              </w:rPr>
-              <w:t>invoices.ts:216 (=0)</w:t>
-            </w:r>
-          </w:p>
-        </w:tc>
-      </w:tr>
     </w:tbl>
     <w:p/>
     <w:p>
@@ -7129,7 +6403,7 @@
         <w:t>server/CLAUDE.md</w:t>
       </w:r>
       <w:r>
-        <w:t>. Los dos puntos marcados 🔶 (categorización CFDI del IVA de comisión y política de retención) requieren decisión del contador antes de operaciones reales.*</w:t>
+        <w:t>. El punto marcado 🔶 (categorización CFDI del IVA de comisión) requiere decisión del contador antes de operaciones reales.*</w:t>
       </w:r>
     </w:p>
     <w:sectPr>

</xml_diff>